<commit_message>
docs(e2e): update guide with Expo Go flows, selector strategy, and pitfalls
- README.md: document flows-exponent/ directory, run-e2e.ps1 Windows runner,
  auto-login guard, selector strategy (label:/text:/point: breakdown), and
  three known pitfalls (Gboard crash, pressKey:back race, label: y>1500px)
- e2e-testing.docx: mirror same updates — sections 3.1, 3.2, 5.3, 7.1, 7.3,
  7.4 updated; new troubleshooting sub-sections 8.1–8.3 added

Co-Authored-By: Claude Sonnet 4.6 <noreply@anthropic.com>
</commit_message>
<xml_diff>
--- a/apps/mobile/docs/e2e-testing.docx
+++ b/apps/mobile/docs/e2e-testing.docx
@@ -1725,7 +1725,7 @@
           <w:sz w:val="20"/>
           <w:szCs w:val="20"/>
         </w:rPr>
-        <w:t xml:space="preserve">Six user journeys cover every major feature area of the app. Each journey starts from a fresh app launch (clearState: true), logs in via the mock API, and verifies the final state of the target screen.</w:t>
+        <w:t>Six user journeys cover every major feature area of the app. There are two sets of flows: flows/ targets the Android dev build (com.anonymous.mobile) and flows-exponent/ targets Expo Go (host.exp.exponent). Both sets cover identical journeys; the Expo Go set is recommended on Windows as it requires no build step. All 6 flows pass (6/6) on Expo Go as of June 2026.</w:t>
       </w:r>
     </w:p>
     <w:p>
@@ -3754,6 +3754,9 @@
       <w:pPr>
         <w:spacing w:after="0" w:before="200"/>
       </w:pPr>
+      <w:r>
+        <w:t>Landing → Sign in → Dashboard. Shared by flows/ and flows-exponent/.</w:t>
+      </w:r>
     </w:p>
     <w:p>
       <w:pPr>
@@ -4765,6 +4768,9 @@
       <w:pPr>
         <w:spacing w:after="0" w:before="200"/>
       </w:pPr>
+      <w:r>
+        <w:t>Landing → Create account → Dashboard. Shared by flows/ and flows-exponent/.</w:t>
+      </w:r>
     </w:p>
     <w:p>
       <w:pPr>
@@ -6052,6 +6058,9 @@
       <w:pPr>
         <w:spacing w:after="0" w:before="200"/>
       </w:pPr>
+      <w:r>
+        <w:t>Login → Medications tab → Add medication → Verify in list. In flows-exponent/: skips the morning time-slot tap (default useState value); uses pressKey: back after Instructions to dismiss keyboard before Save.</w:t>
+      </w:r>
     </w:p>
     <w:p>
       <w:pPr>
@@ -7063,6 +7072,9 @@
       <w:pPr>
         <w:spacing w:after="0" w:before="200"/>
       </w:pPr>
+      <w:r>
+        <w:t>Login → Symptoms tab → Select Pain symptom → Save → Assert '✓ Symptom logged' banner. Note field is skipped to avoid Gboard crash (see Troubleshooting). 'Severity 5/10' is below fold and not asserted.</w:t>
+      </w:r>
     </w:p>
     <w:p>
       <w:pPr>
@@ -8488,6 +8500,9 @@
       <w:pPr>
         <w:spacing w:after="0" w:before="200"/>
       </w:pPr>
+      <w:r>
+        <w:t>Login → All tab bar tabs + dashboard quick links. Shared by flows/ and flows-exponent/.</w:t>
+      </w:r>
     </w:p>
     <w:p>
       <w:pPr>
@@ -10741,6 +10756,9 @@
       <w:pPr>
         <w:spacing w:after="0" w:before="200"/>
       </w:pPr>
+      <w:r>
+        <w:t>Login → Emergency contacts → Caretaker notes → Peggy AI → Edit profile. Uses text: selector for Profile LinkRows and point: for the PeggyFab (see Selector Strategy). No inputText: calls — Gboard crash on natural-language input (see Troubleshooting).</w:t>
+      </w:r>
     </w:p>
     <w:p>
       <w:pPr>
@@ -12249,7 +12267,21 @@
           <w:sz w:val="16"/>
           <w:szCs w:val="16"/>
         </w:rPr>
-        <w:t xml:space="preserve"># Run all flows sequentially (from apps/mobile/)</w:t>
+        <w:t># Windows — Expo Go flows, ADB restart + overlay cleanup between each:</w:t>
+        <w:br/>
+        <w:t>powershell -File scripts\run-e2e.ps1</w:t>
+        <w:br/>
+        <w:br/>
+        <w:t># Dev build / macOS / CI (flows/ directory):</w:t>
+        <w:br/>
+        <w:t># From apps/mobile/</w:t>
+        <w:br/>
+        <w:t>pnpm e2e</w:t>
+        <w:br/>
+        <w:br/>
+        <w:t># Equivalent direct command</w:t>
+        <w:br/>
+        <w:t>maestro test apps/mobile/e2e/flows/</w:t>
       </w:r>
       <w:r>
         <w:rPr>
@@ -12258,8 +12290,6 @@
           <w:sz w:val="16"/>
           <w:szCs w:val="16"/>
         </w:rPr>
-        <w:br/>
-        <w:t xml:space="preserve">pnpm e2e</w:t>
       </w:r>
       <w:r>
         <w:rPr>
@@ -12268,8 +12298,6 @@
           <w:sz w:val="16"/>
           <w:szCs w:val="16"/>
         </w:rPr>
-        <w:br/>
-        <w:t xml:space="preserve"/>
       </w:r>
       <w:r>
         <w:rPr>
@@ -12278,8 +12306,6 @@
           <w:sz w:val="16"/>
           <w:szCs w:val="16"/>
         </w:rPr>
-        <w:br/>
-        <w:t xml:space="preserve"># Equivalent direct command</w:t>
       </w:r>
       <w:r>
         <w:rPr>
@@ -12288,8 +12314,6 @@
           <w:sz w:val="16"/>
           <w:szCs w:val="16"/>
         </w:rPr>
-        <w:br/>
-        <w:t xml:space="preserve">maestro test apps/mobile/e2e/flows/</w:t>
       </w:r>
     </w:p>
     <w:p>
@@ -12313,7 +12337,7 @@
           <w:sz w:val="20"/>
           <w:szCs w:val="20"/>
         </w:rPr>
-        <w:t xml:space="preserve">Flows run in alphabetical order by filename. Each flow starts with a fresh app state (clearState: true), so they are fully independent and can be run in any order.</w:t>
+        <w:t>On Windows, scripts/run-e2e.ps1 force-stops Expo Go, sends KEYCODE_BACK + KEYCODE_HOME to dismiss lingering system overlays, waits 15 s for Metro to reload, then runs each flow sequentially. Output shows [PASSED]/[FAILED] per flow. For dev-build or CI runs, flows run in alphabetical order by filename.</w:t>
       </w:r>
     </w:p>
     <w:p>
@@ -13690,7 +13714,51 @@
           <w:sz w:val="16"/>
           <w:szCs w:val="16"/>
         </w:rPr>
-        <w:t xml:space="preserve">apps/mobile/</w:t>
+        <w:t>apps/mobile/</w:t>
+        <w:br/>
+        <w:t xml:space="preserve">  e2e/</w:t>
+        <w:br/>
+        <w:t xml:space="preserve">    _helpers/</w:t>
+        <w:br/>
+        <w:t xml:space="preserve">      login.yaml              # dev-build login sub-flow</w:t>
+        <w:br/>
+        <w:t xml:space="preserve">      login-exponent.yaml     # Expo Go login (includes auto-login guard)</w:t>
+        <w:br/>
+        <w:t xml:space="preserve">      logout-exponent.yaml    # Expo Go logout</w:t>
+        <w:br/>
+        <w:t xml:space="preserve">    flows/                    # dev build (com.anonymous.mobile)</w:t>
+        <w:br/>
+        <w:t xml:space="preserve">      auth-login.yaml</w:t>
+        <w:br/>
+        <w:t xml:space="preserve">      auth-signup.yaml</w:t>
+        <w:br/>
+        <w:t xml:space="preserve">      medication-add.yaml</w:t>
+        <w:br/>
+        <w:t xml:space="preserve">      symptom-log.yaml</w:t>
+        <w:br/>
+        <w:t xml:space="preserve">      dashboard-navigation.yaml</w:t>
+        <w:br/>
+        <w:t xml:space="preserve">      profile-journey.yaml</w:t>
+        <w:br/>
+        <w:t xml:space="preserve">    flows-exponent/           # Expo Go (host.exp.exponent) — 6/6 passing</w:t>
+        <w:br/>
+        <w:t xml:space="preserve">      auth-login.yaml</w:t>
+        <w:br/>
+        <w:t xml:space="preserve">      auth-signup.yaml</w:t>
+        <w:br/>
+        <w:t xml:space="preserve">      medication-add.yaml</w:t>
+        <w:br/>
+        <w:t xml:space="preserve">      symptom-log.yaml</w:t>
+        <w:br/>
+        <w:t xml:space="preserve">      dashboard-navigation.yaml</w:t>
+        <w:br/>
+        <w:t xml:space="preserve">      profile-journey.yaml</w:t>
+        <w:br/>
+        <w:t xml:space="preserve">    README.md</w:t>
+        <w:br/>
+        <w:t xml:space="preserve">  scripts/</w:t>
+        <w:br/>
+        <w:t xml:space="preserve">    run-e2e.ps1               # Windows PowerShell batch runner</w:t>
       </w:r>
       <w:r>
         <w:rPr>
@@ -13699,8 +13767,6 @@
           <w:sz w:val="16"/>
           <w:szCs w:val="16"/>
         </w:rPr>
-        <w:br/>
-        <w:t xml:space="preserve">  e2e/</w:t>
       </w:r>
       <w:r>
         <w:rPr>
@@ -13709,8 +13775,6 @@
           <w:sz w:val="16"/>
           <w:szCs w:val="16"/>
         </w:rPr>
-        <w:br/>
-        <w:t xml:space="preserve">    _helpers/</w:t>
       </w:r>
       <w:r>
         <w:rPr>
@@ -13719,8 +13783,6 @@
           <w:sz w:val="16"/>
           <w:szCs w:val="16"/>
         </w:rPr>
-        <w:br/>
-        <w:t xml:space="preserve">      login.yaml              # Reusable login sub-flow (runFlow:)</w:t>
       </w:r>
       <w:r>
         <w:rPr>
@@ -13729,8 +13791,6 @@
           <w:sz w:val="16"/>
           <w:szCs w:val="16"/>
         </w:rPr>
-        <w:br/>
-        <w:t xml:space="preserve">    flows/</w:t>
       </w:r>
       <w:r>
         <w:rPr>
@@ -13739,8 +13799,6 @@
           <w:sz w:val="16"/>
           <w:szCs w:val="16"/>
         </w:rPr>
-        <w:br/>
-        <w:t xml:space="preserve">      auth-login.yaml         # Journey 1 — Login</w:t>
       </w:r>
       <w:r>
         <w:rPr>
@@ -13749,8 +13807,6 @@
           <w:sz w:val="16"/>
           <w:szCs w:val="16"/>
         </w:rPr>
-        <w:br/>
-        <w:t xml:space="preserve">      auth-signup.yaml        # Journey 2 — Signup</w:t>
       </w:r>
       <w:r>
         <w:rPr>
@@ -13759,8 +13815,6 @@
           <w:sz w:val="16"/>
           <w:szCs w:val="16"/>
         </w:rPr>
-        <w:br/>
-        <w:t xml:space="preserve">      medication-add.yaml     # Journey 3 — Add medication</w:t>
       </w:r>
       <w:r>
         <w:rPr>
@@ -13769,8 +13823,6 @@
           <w:sz w:val="16"/>
           <w:szCs w:val="16"/>
         </w:rPr>
-        <w:br/>
-        <w:t xml:space="preserve">      symptom-log.yaml        # Journey 4 — Log symptom</w:t>
       </w:r>
       <w:r>
         <w:rPr>
@@ -13779,8 +13831,6 @@
           <w:sz w:val="16"/>
           <w:szCs w:val="16"/>
         </w:rPr>
-        <w:br/>
-        <w:t xml:space="preserve">      dashboard-navigation.yaml # Journey 5 — Full navigation</w:t>
       </w:r>
       <w:r>
         <w:rPr>
@@ -13789,8 +13839,6 @@
           <w:sz w:val="16"/>
           <w:szCs w:val="16"/>
         </w:rPr>
-        <w:br/>
-        <w:t xml:space="preserve">      profile-journey.yaml    # Journey 6 — Profile + Peggy AI</w:t>
       </w:r>
       <w:r>
         <w:rPr>
@@ -13799,8 +13847,6 @@
           <w:sz w:val="16"/>
           <w:szCs w:val="16"/>
         </w:rPr>
-        <w:br/>
-        <w:t xml:space="preserve">    README.md                 # Quick-start guide (Android)</w:t>
       </w:r>
       <w:r>
         <w:rPr>
@@ -13809,8 +13855,6 @@
           <w:sz w:val="16"/>
           <w:szCs w:val="16"/>
         </w:rPr>
-        <w:br/>
-        <w:t xml:space="preserve">  package.json               # Scripts: e2e, e2e:auth, e2e:all</w:t>
       </w:r>
     </w:p>
     <w:p>
@@ -14311,13 +14355,44 @@
           <w:sz w:val="20"/>
           <w:szCs w:val="20"/>
         </w:rPr>
-        <w:t xml:space="preserve">All flows exclusively use label: (Maestro's mapping of React Native accessibilityLabel) because the WCAG 2.1 AA audit added accessibilityLabel to every interactive element. Visible text selectors (tapOn: "Button text") are used only as a fallback where the label and visible text are identical. No testID props were added.</w:t>
+        <w:t>Maestro offers three selector types. Each has a specific role:</w:t>
+        <w:br/>
+        <w:br/>
+        <w:t>label: (content-desc / accessibilityLabel)</w:t>
+        <w:br/>
+        <w:t xml:space="preserve">  Use for: header buttons ("Go back", "Edit profile", "Close assistant"), TextInput fields by accessibilityLabel, elements in the fixed header region or the top ~60% of the screen.</w:t>
+        <w:br/>
+        <w:br/>
+        <w:t>text: (visible Text node)</w:t>
+        <w:br/>
+        <w:t xml:space="preserve">  Use for: Profile index LinkRows ("Emergency contacts", "Caretaker notes"), tab bar labels (tapOn: "Profile"), buttons with emoji or arrow suffixes (use regex: tapOn: text: ".*Emergency").</w:t>
+        <w:br/>
+        <w:br/>
+        <w:t>point: (screen coordinates, bypasses accessibility tree)</w:t>
+        <w:br/>
+        <w:t xml:space="preserve">  Use when label: or text: resolve to the wrong element.</w:t>
+        <w:br/>
+        <w:t xml:space="preserve">  Known cases:</w:t>
+        <w:br/>
+        <w:t xml:space="preserve">    - Peggy FAB (Profile screen)   → point: "89%,74%"</w:t>
+        <w:br/>
+        <w:t xml:space="preserve">      (label: at y≈1730px resolves to Edit Profile header)</w:t>
+        <w:br/>
+        <w:t xml:space="preserve">    - Sign In button               → point: "50%,64%"</w:t>
+        <w:br/>
+        <w:t xml:space="preserve">      (case-insensitive text also matches card title "Sign in")</w:t>
+        <w:br/>
+        <w:t xml:space="preserve">    - Create Account button        → point: "50%,70%"</w:t>
+        <w:br/>
+        <w:br/>
+        <w:t>IMPORTANT: label: is unreliable for elements below y ≈ 1500px on the Profile index screen (1080 × 2340 Pixel 5). Use text: for LinkRows; point: for the FAB.</w:t>
       </w:r>
     </w:p>
     <w:p>
       <w:pPr>
         <w:spacing w:after="0" w:before="120"/>
       </w:pPr>
+      <w:r/>
     </w:p>
     <w:tbl>
       <w:tblPr>
@@ -14969,6 +15044,7 @@
       <w:pPr>
         <w:spacing w:after="0" w:before="160"/>
       </w:pPr>
+      <w:r/>
     </w:p>
     <w:p>
       <w:pPr>
@@ -15003,7 +15079,7 @@
           <w:sz w:val="20"/>
           <w:szCs w:val="20"/>
         </w:rPr>
-        <w:t xml:space="preserve">App ID: com.anonymous.mobile (Expo default — no bundleIdentifier set in app.json).</w:t>
+        <w:t>App ID: Two targets — com.anonymous.mobile (dev build, flows/) and host.exp.exponent (Expo Go, flows-exponent/). The PowerShell runner targets Expo Go; pnpm e2e targets the dev build.</w:t>
       </w:r>
     </w:p>
     <w:p>
@@ -15022,7 +15098,7 @@
           <w:sz w:val="20"/>
           <w:szCs w:val="20"/>
         </w:rPr>
-        <w:t xml:space="preserve">Back navigation: The app disables the Android predictive back gesture (predictiveBackGestureEnabled: false in app.json). All nested screens have an explicit "Go back" button with accessibilityLabel="Go back". The flows use tapOn: label: "Go back" — the Maestro back command is not needed.</w:t>
+        <w:t>Back navigation: The app disables the Android predictive back gesture (predictiveBackGestureEnabled: false in app.json). All flows use tapOn: label: "Go back" for the explicit header back button.</w:t>
       </w:r>
     </w:p>
     <w:p>
@@ -15041,7 +15117,7 @@
           <w:sz w:val="20"/>
           <w:szCs w:val="20"/>
         </w:rPr>
-        <w:t xml:space="preserve">clearState: true: Clears Android SharedPreferences and Expo SecureStore between runs. This forces re-authentication on every flow.</w:t>
+        <w:t>SecureStore persistence: Expo Go retains the auth token across force-stops. login-exponent.yaml begins with optional Profile → Sign out steps (auto-login guard) so each flow reliably starts from the Landing screen even if a prior flow crashed before logout ran.</w:t>
       </w:r>
     </w:p>
     <w:p>
@@ -15060,7 +15136,7 @@
           <w:sz w:val="20"/>
           <w:szCs w:val="20"/>
         </w:rPr>
-        <w:t xml:space="preserve">Expo Go vs dev build: Flows run with appId: com.anonymous.mobile which requires a dev build (npx expo run:android). For Expo Go, remove the appId line and launchApp step, start the app first, then run maestro test.</w:t>
+        <w:t>Expo Go vs dev build: flows-exponent/ is recommended on Windows (no build step). For CI or standalone dev build, use flows/ with npx expo run:android.</w:t>
       </w:r>
     </w:p>
     <w:p>
@@ -15839,6 +15915,75 @@
       <w:pPr>
         <w:spacing w:after="0" w:before="160"/>
       </w:pPr>
+    </w:p>
+    <w:p>
+      <w:pPr>
+        <w:pStyle w:val="Heading2"/>
+      </w:pPr>
+      <w:r>
+        <w:t>8.1 Gboard crash on inputText: with natural-language text</w:t>
+      </w:r>
+    </w:p>
+    <w:p>
+      <w:r>
+        <w:t>Symptom: A fullscreen "Something went wrong / communicating with Google servers" dialog appears and blocks all subsequent assertions after injecting free-text into a multiline TextInput (caretaker notes, Peggy messages, incident log). The dialog survives am force-stop because it runs in a separate process.</w:t>
+      </w:r>
+    </w:p>
+    <w:p>
+      <w:r>
+        <w:t>Cause: The emulator has Gboard installed but no Google network access. Free-text injection triggers Gboard’s cloud-autocomplete feature.</w:t>
+      </w:r>
+    </w:p>
+    <w:p>
+      <w:r>
+        <w:t>Fix: Omit inputText: for natural-language TextInputs in E2E flows. Cover those features with integration tests (MSW + RNTL). Only use inputText: for structured fields: email, password, medication name/dose.</w:t>
+      </w:r>
+    </w:p>
+    <w:p>
+      <w:pPr>
+        <w:pStyle w:val="Heading2"/>
+      </w:pPr>
+      <w:r>
+        <w:t>8.2 pressKey: back race condition</w:t>
+      </w:r>
+    </w:p>
+    <w:p>
+      <w:r>
+        <w:t>Symptom: The flow navigates one screen too far — e.g., from a pushed route back to Dashboard instead of just closing the keyboard.</w:t>
+      </w:r>
+    </w:p>
+    <w:p>
+      <w:r>
+        <w:t>Cause: pressKey: back fired immediately after tapOn: on a TextInput can arrive before the keyboard fully renders. Android routes KEYCODE_BACK to navigation when no IME is visible, popping the current route.</w:t>
+      </w:r>
+    </w:p>
+    <w:p>
+      <w:r>
+        <w:t>Fix: Only use pressKey: back on a pushed route where back definitively means "close keyboard." To navigate back from a screen with an open keyboard, use tapOn: label: "Go back" — the header back button closes the keyboard as a side effect.</w:t>
+      </w:r>
+    </w:p>
+    <w:p>
+      <w:pPr>
+        <w:pStyle w:val="Heading2"/>
+      </w:pPr>
+      <w:r>
+        <w:t>8.3 label: mismatch at y &gt; 1500px on Profile index</w:t>
+      </w:r>
+    </w:p>
+    <w:p>
+      <w:r>
+        <w:t>Symptom: tapOn: label: "Emergency contacts" or tapOn: label: "Open Peggy assistant" navigates to Edit Profile instead.</w:t>
+      </w:r>
+    </w:p>
+    <w:p>
+      <w:r>
+        <w:t>Cause: On the Profile index screen (1080 × 2340 Pixel 5), content-desc resolution for elements below y ≈ 1500px consistently resolves to the Edit Profile header button at y ≈ 220. Root cause unconfirmed at the framework level.</w:t>
+      </w:r>
+    </w:p>
+    <w:p>
+      <w:r>
+        <w:t>Fix: Use tapOn: text: for Profile LinkRows ("Emergency contacts", "Caretaker notes"). Use tapOn: point: "89%,74%" for the PeggyFab. Precede the FAB tap with tapOn: "Profile" to flush any pending navigation animation.</w:t>
+      </w:r>
     </w:p>
     <w:sectPr>
       <w:pgSz w:w="11906" w:h="16838" w:orient="portrait"/>

</xml_diff>